<commit_message>
Prerequisites.docx is updated. code1-frontend.txt is added.
</commit_message>
<xml_diff>
--- a/Prerequisites.docx
+++ b/Prerequisites.docx
@@ -23,17 +23,7 @@
           <w:sz w:val="32"/>
           <w:szCs w:val="32"/>
         </w:rPr>
-        <w:t>P</w:t>
-      </w:r>
-      <w:r>
-        <w:rPr>
-          <w:rFonts w:ascii="Seaford" w:hAnsi="Seaford"/>
-          <w:b/>
-          <w:bCs/>
-          <w:sz w:val="32"/>
-          <w:szCs w:val="32"/>
-        </w:rPr>
-        <w:t>rerequisite</w:t>
+        <w:t>Prerequisite</w:t>
       </w:r>
       <w:r>
         <w:rPr>
@@ -79,13 +69,7 @@
         <w:rPr>
           <w:rFonts w:ascii="Seaford" w:hAnsi="Seaford"/>
         </w:rPr>
-        <w:t xml:space="preserve"> 9.0 Desktop Runtime (v9.0.14)</w:t>
-      </w:r>
-      <w:r>
-        <w:rPr>
-          <w:rFonts w:ascii="Seaford" w:hAnsi="Seaford"/>
-        </w:rPr>
-        <w:t xml:space="preserve"> from </w:t>
+        <w:t xml:space="preserve"> 9.0 Desktop Runtime (v9.0.14) from </w:t>
       </w:r>
       <w:r>
         <w:rPr>
@@ -155,6 +139,7 @@
       <w:r>
         <w:rPr>
           <w:rFonts w:ascii="Seaford" w:hAnsi="Seaford"/>
+          <w:noProof/>
         </w:rPr>
         <w:drawing>
           <wp:inline distT="0" distB="0" distL="0" distR="0" wp14:anchorId="100D67FC" wp14:editId="6C1D6C36">
@@ -281,6 +266,7 @@
       <w:r>
         <w:rPr>
           <w:rFonts w:ascii="Seaford" w:hAnsi="Seaford"/>
+          <w:noProof/>
         </w:rPr>
         <w:drawing>
           <wp:inline distT="0" distB="0" distL="0" distR="0" wp14:anchorId="2F9EFE13" wp14:editId="69BB74E2">
@@ -530,6 +516,97 @@
       <w:pPr>
         <w:pStyle w:val="ListParagraph"/>
         <w:ind w:left="360"/>
+        <w:rPr>
+          <w:rFonts w:ascii="Seaford" w:hAnsi="Seaford"/>
+        </w:rPr>
+      </w:pPr>
+    </w:p>
+    <w:p>
+      <w:pPr>
+        <w:pStyle w:val="ListParagraph"/>
+        <w:numPr>
+          <w:ilvl w:val="0"/>
+          <w:numId w:val="1"/>
+        </w:numPr>
+        <w:rPr>
+          <w:rFonts w:ascii="Seaford" w:hAnsi="Seaford"/>
+        </w:rPr>
+      </w:pPr>
+      <w:r>
+        <w:rPr>
+          <w:rFonts w:ascii="Seaford" w:hAnsi="Seaford"/>
+        </w:rPr>
+        <w:t>Install postman. We’ll use it to communicate with the backend application.</w:t>
+      </w:r>
+    </w:p>
+    <w:p>
+      <w:pPr>
+        <w:pStyle w:val="ListParagraph"/>
+        <w:ind w:left="360"/>
+        <w:rPr>
+          <w:rFonts w:ascii="Seaford" w:hAnsi="Seaford"/>
+        </w:rPr>
+      </w:pPr>
+      <w:hyperlink r:id="rId14" w:history="1">
+        <w:r>
+          <w:rPr>
+            <w:rStyle w:val="Hyperlink"/>
+            <w:rFonts w:ascii="Seaford" w:hAnsi="Seaford"/>
+          </w:rPr>
+          <w:t>https://www.postman.com/downloads/</w:t>
+        </w:r>
+      </w:hyperlink>
+    </w:p>
+    <w:p>
+      <w:pPr>
+        <w:pStyle w:val="ListParagraph"/>
+        <w:ind w:left="360"/>
+        <w:rPr>
+          <w:rFonts w:ascii="Seaford" w:hAnsi="Seaford"/>
+        </w:rPr>
+      </w:pPr>
+    </w:p>
+    <w:p>
+      <w:pPr>
+        <w:pStyle w:val="ListParagraph"/>
+        <w:numPr>
+          <w:ilvl w:val="0"/>
+          <w:numId w:val="1"/>
+        </w:numPr>
+        <w:rPr>
+          <w:rFonts w:ascii="Seaford" w:hAnsi="Seaford"/>
+        </w:rPr>
+      </w:pPr>
+      <w:r>
+        <w:rPr>
+          <w:rFonts w:ascii="Seaford" w:hAnsi="Seaford"/>
+        </w:rPr>
+        <w:lastRenderedPageBreak/>
+        <w:t xml:space="preserve">If you would like to complete the cloud hosting portion, please create and verify an AWS Free Tier account at </w:t>
+      </w:r>
+      <w:hyperlink r:id="rId15" w:tgtFrame="_new" w:history="1">
+        <w:r>
+          <w:rPr>
+            <w:rStyle w:val="Hyperlink"/>
+            <w:rFonts w:ascii="Seaford" w:hAnsi="Seaford"/>
+          </w:rPr>
+          <w:t>https://aws.amazon.com/free/</w:t>
+        </w:r>
+      </w:hyperlink>
+      <w:r>
+        <w:rPr>
+          <w:rFonts w:ascii="Seaford" w:hAnsi="Seaford"/>
+        </w:rPr>
+        <w:t>. AWS may charge a temporary $1 authorization fee during the verification process, which will be refunded after verification is complete.</w:t>
+      </w:r>
+    </w:p>
+    <w:p>
+      <w:pPr>
+        <w:pStyle w:val="ListParagraph"/>
+        <w:numPr>
+          <w:ilvl w:val="0"/>
+          <w:numId w:val="1"/>
+        </w:numPr>
         <w:rPr>
           <w:rFonts w:ascii="Seaford" w:hAnsi="Seaford"/>
         </w:rPr>
@@ -1343,7 +1420,6 @@
   <w:style w:type="character" w:default="1" w:styleId="DefaultParagraphFont">
     <w:name w:val="Default Paragraph Font"/>
     <w:uiPriority w:val="1"/>
-    <w:semiHidden/>
     <w:unhideWhenUsed/>
   </w:style>
   <w:style w:type="table" w:default="1" w:styleId="TableNormal">

</xml_diff>

<commit_message>
Cloud migration settings and AWS RDS setting were uploaded.
</commit_message>
<xml_diff>
--- a/Prerequisites.docx
+++ b/Prerequisites.docx
@@ -69,7 +69,19 @@
         <w:rPr>
           <w:rFonts w:ascii="Seaford" w:hAnsi="Seaford"/>
         </w:rPr>
-        <w:t xml:space="preserve"> 9.0 Desktop Runtime (v9.0.14) from </w:t>
+        <w:t xml:space="preserve"> 9.0 </w:t>
+      </w:r>
+      <w:r>
+        <w:rPr>
+          <w:rFonts w:ascii="Seaford" w:hAnsi="Seaford"/>
+        </w:rPr>
+        <w:t xml:space="preserve">SDK </w:t>
+      </w:r>
+      <w:r>
+        <w:rPr>
+          <w:rFonts w:ascii="Seaford" w:hAnsi="Seaford"/>
+        </w:rPr>
+        <w:t xml:space="preserve">(v9.0.14) from </w:t>
       </w:r>
       <w:r>
         <w:rPr>
@@ -108,44 +120,15 @@
           <w:rFonts w:ascii="Seaford" w:hAnsi="Seaford"/>
         </w:rPr>
       </w:pPr>
-      <w:hyperlink r:id="rId6" w:history="1">
-        <w:r>
-          <w:rPr>
-            <w:rStyle w:val="Hyperlink"/>
-            <w:rFonts w:ascii="Seaford" w:hAnsi="Seaford"/>
-          </w:rPr>
-          <w:t>https://dotnet.microsoft.com/en-us/download/dotnet/thank-you/runtime-desktop-9.0.14-windows-x64-installer</w:t>
-        </w:r>
-      </w:hyperlink>
-      <w:r>
-        <w:rPr>
-          <w:rFonts w:ascii="Seaford" w:hAnsi="Seaford"/>
-        </w:rPr>
-        <w:t xml:space="preserve"> </w:t>
-      </w:r>
-      <w:r>
-        <w:rPr>
-          <w:rFonts w:ascii="Seaford" w:hAnsi="Seaford"/>
-        </w:rPr>
-        <w:t>(for windows).</w:t>
-      </w:r>
-    </w:p>
-    <w:p>
-      <w:pPr>
-        <w:rPr>
-          <w:rFonts w:ascii="Seaford" w:hAnsi="Seaford"/>
-        </w:rPr>
-      </w:pPr>
-      <w:r>
-        <w:rPr>
-          <w:rFonts w:ascii="Seaford" w:hAnsi="Seaford"/>
-          <w:noProof/>
+      <w:r>
+        <w:rPr>
+          <w:rFonts w:ascii="Seaford" w:hAnsi="Seaford"/>
         </w:rPr>
         <w:drawing>
-          <wp:inline distT="0" distB="0" distL="0" distR="0" wp14:anchorId="100D67FC" wp14:editId="6C1D6C36">
-            <wp:extent cx="3238500" cy="702367"/>
-            <wp:effectExtent l="0" t="0" r="0" b="2540"/>
-            <wp:docPr id="2142422307" name="Picture 1"/>
+          <wp:inline distT="0" distB="0" distL="0" distR="0" wp14:anchorId="2EA9456E" wp14:editId="6B8EB652">
+            <wp:extent cx="5943600" cy="1541145"/>
+            <wp:effectExtent l="0" t="0" r="0" b="1905"/>
+            <wp:docPr id="1738230658" name="Picture 1"/>
             <wp:cNvGraphicFramePr>
               <a:graphicFrameLocks xmlns:a="http://schemas.openxmlformats.org/drawingml/2006/main" noChangeAspect="1"/>
             </wp:cNvGraphicFramePr>
@@ -153,11 +136,11 @@
               <a:graphicData uri="http://schemas.openxmlformats.org/drawingml/2006/picture">
                 <pic:pic xmlns:pic="http://schemas.openxmlformats.org/drawingml/2006/picture">
                   <pic:nvPicPr>
-                    <pic:cNvPr id="2142422307" name=""/>
+                    <pic:cNvPr id="1738230658" name=""/>
                     <pic:cNvPicPr/>
                   </pic:nvPicPr>
                   <pic:blipFill>
-                    <a:blip r:embed="rId7"/>
+                    <a:blip r:embed="rId6"/>
                     <a:stretch>
                       <a:fillRect/>
                     </a:stretch>
@@ -165,7 +148,7 @@
                   <pic:spPr>
                     <a:xfrm>
                       <a:off x="0" y="0"/>
-                      <a:ext cx="3260827" cy="707209"/>
+                      <a:ext cx="5943600" cy="1541145"/>
                     </a:xfrm>
                     <a:prstGeom prst="rect">
                       <a:avLst/>
@@ -180,13 +163,6 @@
     </w:p>
     <w:p>
       <w:pPr>
-        <w:rPr>
-          <w:rFonts w:ascii="Seaford" w:hAnsi="Seaford"/>
-        </w:rPr>
-      </w:pPr>
-    </w:p>
-    <w:p>
-      <w:pPr>
         <w:pStyle w:val="ListParagraph"/>
         <w:numPr>
           <w:ilvl w:val="0"/>
@@ -200,16 +176,8 @@
         <w:rPr>
           <w:rFonts w:ascii="Seaford" w:hAnsi="Seaford"/>
         </w:rPr>
-        <w:t xml:space="preserve">Install </w:t>
-      </w:r>
-      <w:proofErr w:type="spellStart"/>
-      <w:r>
-        <w:rPr>
-          <w:rFonts w:ascii="Seaford" w:hAnsi="Seaford"/>
-        </w:rPr>
-        <w:t>Node.Js</w:t>
-      </w:r>
-      <w:proofErr w:type="spellEnd"/>
+        <w:t>Install Node.Js</w:t>
+      </w:r>
       <w:r>
         <w:rPr>
           <w:rFonts w:ascii="Seaford" w:hAnsi="Seaford"/>
@@ -241,7 +209,7 @@
           <w:rFonts w:ascii="Seaford" w:hAnsi="Seaford"/>
         </w:rPr>
       </w:pPr>
-      <w:hyperlink r:id="rId8" w:history="1">
+      <w:hyperlink r:id="rId7" w:history="1">
         <w:r>
           <w:rPr>
             <w:rStyle w:val="Hyperlink"/>
@@ -284,7 +252,7 @@
                     <pic:cNvPicPr/>
                   </pic:nvPicPr>
                   <pic:blipFill>
-                    <a:blip r:embed="rId9"/>
+                    <a:blip r:embed="rId8"/>
                     <a:stretch>
                       <a:fillRect/>
                     </a:stretch>
@@ -336,7 +304,7 @@
           <w:rFonts w:ascii="Seaford" w:hAnsi="Seaford"/>
         </w:rPr>
       </w:pPr>
-      <w:hyperlink r:id="rId10" w:history="1">
+      <w:hyperlink r:id="rId9" w:history="1">
         <w:r>
           <w:rPr>
             <w:rStyle w:val="Hyperlink"/>
@@ -358,7 +326,7 @@
           <w:rFonts w:ascii="Seaford" w:hAnsi="Seaford"/>
         </w:rPr>
       </w:pPr>
-      <w:hyperlink r:id="rId11" w:history="1">
+      <w:hyperlink r:id="rId10" w:history="1">
         <w:r>
           <w:rPr>
             <w:rStyle w:val="Hyperlink"/>
@@ -425,7 +393,7 @@
           <w:rFonts w:ascii="Seaford" w:hAnsi="Seaford"/>
         </w:rPr>
       </w:pPr>
-      <w:hyperlink r:id="rId12" w:history="1">
+      <w:hyperlink r:id="rId11" w:history="1">
         <w:r>
           <w:rPr>
             <w:rStyle w:val="Hyperlink"/>
@@ -465,21 +433,7 @@
         <w:rPr>
           <w:rFonts w:ascii="Seaford" w:hAnsi="Seaford"/>
         </w:rPr>
-        <w:t xml:space="preserve">Create a </w:t>
-      </w:r>
-      <w:proofErr w:type="spellStart"/>
-      <w:r>
-        <w:rPr>
-          <w:rFonts w:ascii="Seaford" w:hAnsi="Seaford"/>
-        </w:rPr>
-        <w:t>github</w:t>
-      </w:r>
-      <w:proofErr w:type="spellEnd"/>
-      <w:r>
-        <w:rPr>
-          <w:rFonts w:ascii="Seaford" w:hAnsi="Seaford"/>
-        </w:rPr>
-        <w:t xml:space="preserve"> account (optional)</w:t>
+        <w:t>Create a github account (optional)</w:t>
       </w:r>
     </w:p>
     <w:p>
@@ -496,7 +450,7 @@
         </w:rPr>
         <w:t xml:space="preserve">See this video: </w:t>
       </w:r>
-      <w:hyperlink r:id="rId13" w:history="1">
+      <w:hyperlink r:id="rId12" w:history="1">
         <w:r>
           <w:rPr>
             <w:rStyle w:val="Hyperlink"/>
@@ -547,7 +501,7 @@
           <w:rFonts w:ascii="Seaford" w:hAnsi="Seaford"/>
         </w:rPr>
       </w:pPr>
-      <w:hyperlink r:id="rId14" w:history="1">
+      <w:hyperlink r:id="rId13" w:history="1">
         <w:r>
           <w:rPr>
             <w:rStyle w:val="Hyperlink"/>
@@ -584,7 +538,7 @@
         <w:lastRenderedPageBreak/>
         <w:t xml:space="preserve">If you would like to complete the cloud hosting portion, please create and verify an AWS Free Tier account at </w:t>
       </w:r>
-      <w:hyperlink r:id="rId15" w:tgtFrame="_new" w:history="1">
+      <w:hyperlink r:id="rId14" w:tgtFrame="_new" w:history="1">
         <w:r>
           <w:rPr>
             <w:rStyle w:val="Hyperlink"/>
@@ -1420,6 +1374,7 @@
   <w:style w:type="character" w:default="1" w:styleId="DefaultParagraphFont">
     <w:name w:val="Default Paragraph Font"/>
     <w:uiPriority w:val="1"/>
+    <w:semiHidden/>
     <w:unhideWhenUsed/>
   </w:style>
   <w:style w:type="table" w:default="1" w:styleId="TableNormal">

</xml_diff>